<commit_message>
Actividad 1 y 2, en la 2 hicimos lo del perceptron
me equivoque, la uno en realidad era otra, la que subi anteriormente es la 2, no la 1, pero pues aqui ya esta corregido.
</commit_message>
<xml_diff>
--- a/Primer-Semana-TecnicasDeInteligenciaArtificial.docx
+++ b/Primer-Semana-TecnicasDeInteligenciaArtificial.docx
@@ -47,7 +47,46 @@
         <w:rPr>
           <w:rtl w:val="0"/>
         </w:rPr>
-        <w:t xml:space="preserve"> En el día 1 investigamos sobre el perceptrón, el cual es una neurona artificial que funciona de manera similar a una neurona biológica. Su principal función es recibir diferentes entradas, procesarlas mediante pesos y una función de activación, y finalmente generar una salida.</w:t>
+        <w:t xml:space="preserve"> En el día 1 vimos la introducción a la clase y el profe nos dio la opción de elegir como calificación final un 7 (el cual no elegí porque si lo hubiera hecho, no existiría este documento de Word).</w:t>
+      </w:r>
+    </w:p>
+    <w:p>
+      <w:pPr>
+        <w:rPr/>
+      </w:pPr>
+      <w:r>
+        <w:rPr>
+          <w:rtl w:val="0"/>
+        </w:rPr>
+      </w:r>
+    </w:p>
+    <w:p>
+      <w:pPr>
+        <w:rPr/>
+      </w:pPr>
+      <w:r>
+        <w:rPr>
+          <w:b w:val="1"/>
+          <w:bCs w:val="1"/>
+          <w:rtl w:val="0"/>
+        </w:rPr>
+        <w:t xml:space="preserve">Actividad 2:</w:t>
+      </w:r>
+      <w:r>
+        <w:rPr>
+          <w:rtl w:val="0"/>
+        </w:rPr>
+        <w:t xml:space="preserve"> En el día 2 investigamos sobre el perceptrón, el cual es una neurona artificial que funciona de manera similar a una neurona biológica. Su principal función es recibir diferentes entradas, procesarlas mediante pesos y una función de activación, y finalmente generar una salida.</w:t>
+      </w:r>
+    </w:p>
+    <w:p>
+      <w:pPr>
+        <w:rPr/>
+      </w:pPr>
+      <w:r>
+        <w:rPr>
+          <w:rtl w:val="0"/>
+        </w:rPr>
       </w:r>
     </w:p>
     <w:sectPr>

</xml_diff>